<commit_message>
Small update and cleanup
</commit_message>
<xml_diff>
--- a/Homework_doxmaker/Overview_Week_01.docx
+++ b/Homework_doxmaker/Overview_Week_01.docx
@@ -5,9 +5,88 @@
     <w:p>
       <w:pPr>
         <w:pStyle w:val="Title"/>
+        <w:jc w:val="center"/>
       </w:pPr>
       <w:r>
-        <w:t>Homework Overview: Week_01</w:t>
+        <w:t>Homework: Week_01</w:t>
+      </w:r>
+    </w:p>
+    <w:p>
+      <w:pPr>
+        <w:jc w:val="center"/>
+      </w:pPr>
+      <w:r>
+        <w:rPr>
+          <w:i/>
+        </w:rPr>
+        <w:t>Homework Report</w:t>
+      </w:r>
+    </w:p>
+    <w:p>
+      <w:r>
+        <w:br/>
+        <w:br/>
+        <w:br/>
+        <w:br/>
+        <w:br/>
+      </w:r>
+    </w:p>
+    <w:p>
+      <w:pPr>
+        <w:jc w:val="center"/>
+      </w:pPr>
+      <w:r>
+        <w:rPr>
+          <w:b/>
+          <w:sz w:val="25"/>
+        </w:rPr>
+        <w:t>Student: Robin Somers</w:t>
+        <w:br/>
+      </w:r>
+      <w:r>
+        <w:rPr>
+          <w:b/>
+          <w:sz w:val="25"/>
+        </w:rPr>
+        <w:t>Student Number: 1915369</w:t>
+        <w:br/>
+      </w:r>
+      <w:r>
+        <w:rPr>
+          <w:b/>
+          <w:sz w:val="25"/>
+        </w:rPr>
+        <w:t>Group: IMAGINE</w:t>
+        <w:br/>
+      </w:r>
+      <w:r>
+        <w:rPr>
+          <w:b/>
+          <w:sz w:val="25"/>
+        </w:rPr>
+        <w:t>Course: MNLE</w:t>
+        <w:br/>
+      </w:r>
+      <w:r>
+        <w:rPr>
+          <w:b/>
+          <w:sz w:val="25"/>
+        </w:rPr>
+        <w:t>Date: 2026-01-23</w:t>
+        <w:br/>
+      </w:r>
+    </w:p>
+    <w:p>
+      <w:r>
+        <w:br w:type="page"/>
+      </w:r>
+    </w:p>
+    <w:p>
+      <w:pPr>
+        <w:pStyle w:val="Heading1"/>
+      </w:pPr>
+      <w:r>
+        <w:t>Overview: Week_01</w:t>
       </w:r>
     </w:p>
     <w:p>

</xml_diff>